<commit_message>
Login Module and Firebase V2 commit
</commit_message>
<xml_diff>
--- a/WorkTime.docx
+++ b/WorkTime.docx
@@ -8,44 +8,31 @@
       </w:r>
     </w:p>
     <w:p>
-      <w:proofErr w:type="gramStart"/>
       <w:r>
-        <w:t>gün</w:t>
-      </w:r>
-      <w:proofErr w:type="gramEnd"/>
-      <w:r>
-        <w:t xml:space="preserve"> 1 : 1h</w:t>
-      </w:r>
-    </w:p>
-    <w:p>
-      <w:proofErr w:type="gramStart"/>
-      <w:r>
-        <w:t>gün</w:t>
-      </w:r>
-      <w:proofErr w:type="gramEnd"/>
-      <w:r>
-        <w:t xml:space="preserve"> 2 : 45m</w:t>
-      </w:r>
-    </w:p>
-    <w:p>
-      <w:proofErr w:type="gramStart"/>
-      <w:r>
-        <w:t>gün</w:t>
-      </w:r>
-      <w:proofErr w:type="gramEnd"/>
-      <w:r>
-        <w:t xml:space="preserve"> 3 : 36m</w:t>
+        <w:t>gün 1 : 1h</w:t>
       </w:r>
     </w:p>
     <w:p>
       <w:r>
-        <w:rPr>
-          <w:noProof/>
-        </w:rPr>
+        <w:t>gün 2 : 45m</w:t>
+      </w:r>
+    </w:p>
+    <w:p>
+      <w:r>
+        <w:t>gün 3 : 36m</w:t>
+      </w:r>
+    </w:p>
+    <w:p>
+      <w:r>
+        <w:t>gün 4 : 1h 3m</w:t>
+      </w:r>
+    </w:p>
+    <w:p>
+      <w:r>
         <w:drawing>
-          <wp:inline distT="0" distB="0" distL="0" distR="0" wp14:anchorId="60737A82" wp14:editId="20F2F820">
-            <wp:extent cx="5743575" cy="2524125"/>
-            <wp:effectExtent l="0" t="0" r="9525" b="9525"/>
+          <wp:inline distT="0" distB="0" distL="0" distR="0" wp14:anchorId="7EA34660" wp14:editId="166C7E3B">
+            <wp:extent cx="5760720" cy="2848610"/>
+            <wp:effectExtent l="0" t="0" r="0" b="8890"/>
             <wp:docPr id="1" name="Resim 1"/>
             <wp:cNvGraphicFramePr>
               <a:graphicFrameLocks xmlns:a="http://schemas.openxmlformats.org/drawingml/2006/main" noChangeAspect="1"/>
@@ -54,36 +41,67 @@
               <a:graphicData uri="http://schemas.openxmlformats.org/drawingml/2006/picture">
                 <pic:pic xmlns:pic="http://schemas.openxmlformats.org/drawingml/2006/picture">
                   <pic:nvPicPr>
-                    <pic:cNvPr id="0" name="Picture 1"/>
-                    <pic:cNvPicPr>
-                      <a:picLocks noChangeAspect="1" noChangeArrowheads="1"/>
-                    </pic:cNvPicPr>
+                    <pic:cNvPr id="1" name=""/>
+                    <pic:cNvPicPr/>
                   </pic:nvPicPr>
                   <pic:blipFill>
-                    <a:blip r:embed="rId4" cstate="print">
-                      <a:extLst>
-                        <a:ext uri="{28A0092B-C50C-407E-A947-70E740481C1C}">
-                          <a14:useLocalDpi xmlns:a14="http://schemas.microsoft.com/office/drawing/2010/main" val="0"/>
-                        </a:ext>
-                      </a:extLst>
-                    </a:blip>
-                    <a:srcRect/>
+                    <a:blip r:embed="rId4"/>
                     <a:stretch>
                       <a:fillRect/>
                     </a:stretch>
                   </pic:blipFill>
-                  <pic:spPr bwMode="auto">
+                  <pic:spPr>
                     <a:xfrm>
                       <a:off x="0" y="0"/>
-                      <a:ext cx="5743575" cy="2524125"/>
+                      <a:ext cx="5760720" cy="2848610"/>
                     </a:xfrm>
                     <a:prstGeom prst="rect">
                       <a:avLst/>
                     </a:prstGeom>
-                    <a:noFill/>
-                    <a:ln>
-                      <a:noFill/>
-                    </a:ln>
+                  </pic:spPr>
+                </pic:pic>
+              </a:graphicData>
+            </a:graphic>
+          </wp:inline>
+        </w:drawing>
+      </w:r>
+    </w:p>
+    <w:p>
+      <w:r>
+        <w:t>Buda farklı bir pluginden bu kod yazdığım saati değil arka planda açıksa bile zaman sayıyo o yüzden 10 saat al code write o al promt anti gravitye konu anlattırdım onlar</w:t>
+      </w:r>
+    </w:p>
+    <w:p>
+      <w:r>
+        <w:drawing>
+          <wp:inline distT="0" distB="0" distL="0" distR="0" wp14:anchorId="3739113E" wp14:editId="235751AA">
+            <wp:extent cx="5344271" cy="3077004"/>
+            <wp:effectExtent l="0" t="0" r="8890" b="9525"/>
+            <wp:docPr id="2" name="Resim 2"/>
+            <wp:cNvGraphicFramePr>
+              <a:graphicFrameLocks xmlns:a="http://schemas.openxmlformats.org/drawingml/2006/main" noChangeAspect="1"/>
+            </wp:cNvGraphicFramePr>
+            <a:graphic xmlns:a="http://schemas.openxmlformats.org/drawingml/2006/main">
+              <a:graphicData uri="http://schemas.openxmlformats.org/drawingml/2006/picture">
+                <pic:pic xmlns:pic="http://schemas.openxmlformats.org/drawingml/2006/picture">
+                  <pic:nvPicPr>
+                    <pic:cNvPr id="1" name=""/>
+                    <pic:cNvPicPr/>
+                  </pic:nvPicPr>
+                  <pic:blipFill>
+                    <a:blip r:embed="rId5"/>
+                    <a:stretch>
+                      <a:fillRect/>
+                    </a:stretch>
+                  </pic:blipFill>
+                  <pic:spPr>
+                    <a:xfrm>
+                      <a:off x="0" y="0"/>
+                      <a:ext cx="5344271" cy="3077004"/>
+                    </a:xfrm>
+                    <a:prstGeom prst="rect">
+                      <a:avLst/>
+                    </a:prstGeom>
                   </pic:spPr>
                 </pic:pic>
               </a:graphicData>

</xml_diff>

<commit_message>
room database v2 commit
</commit_message>
<xml_diff>
--- a/WorkTime.docx
+++ b/WorkTime.docx
@@ -4,35 +4,68 @@
   <w:body>
     <w:p>
       <w:r>
-        <w:t>2h21m toplam çalışma süresi bu süre https://analogwakatime.com/dashboard adresinden ve orası toplam kod yazma süresi</w:t>
+        <w:t>4h18m</w:t>
+      </w:r>
+      <w:r>
+        <w:t>m toplam çalışma süresi bu süre https://analogwakatime.com/dashboard adresinden ve orası toplam kod yazma süresi</w:t>
       </w:r>
     </w:p>
     <w:p>
-      <w:r>
-        <w:t>gün 1 : 1h</w:t>
+      <w:proofErr w:type="gramStart"/>
+      <w:r>
+        <w:t>gün</w:t>
+      </w:r>
+      <w:proofErr w:type="gramEnd"/>
+      <w:r>
+        <w:t xml:space="preserve"> 1 : 1h</w:t>
       </w:r>
     </w:p>
     <w:p>
-      <w:r>
-        <w:t>gün 2 : 45m</w:t>
+      <w:proofErr w:type="gramStart"/>
+      <w:r>
+        <w:t>gün</w:t>
+      </w:r>
+      <w:proofErr w:type="gramEnd"/>
+      <w:r>
+        <w:t xml:space="preserve"> 2 : 45m</w:t>
       </w:r>
     </w:p>
     <w:p>
-      <w:r>
-        <w:t>gün 3 : 36m</w:t>
+      <w:proofErr w:type="gramStart"/>
+      <w:r>
+        <w:t>gün</w:t>
+      </w:r>
+      <w:proofErr w:type="gramEnd"/>
+      <w:r>
+        <w:t xml:space="preserve"> 3 : 36m</w:t>
       </w:r>
     </w:p>
     <w:p>
-      <w:r>
-        <w:t>gün 4 : 1h 3m</w:t>
+      <w:proofErr w:type="gramStart"/>
+      <w:r>
+        <w:t>gün</w:t>
+      </w:r>
+      <w:proofErr w:type="gramEnd"/>
+      <w:r>
+        <w:t xml:space="preserve"> 4 : 1h 3m</w:t>
       </w:r>
     </w:p>
     <w:p>
+      <w:proofErr w:type="gramStart"/>
+      <w:r>
+        <w:t>gün</w:t>
+      </w:r>
+      <w:proofErr w:type="gramEnd"/>
+      <w:r>
+        <w:t xml:space="preserve"> 5 : 53m</w:t>
+      </w:r>
+    </w:p>
+    <w:p>
       <w:r>
         <w:drawing>
-          <wp:inline distT="0" distB="0" distL="0" distR="0" wp14:anchorId="7EA34660" wp14:editId="166C7E3B">
-            <wp:extent cx="5760720" cy="2848610"/>
-            <wp:effectExtent l="0" t="0" r="0" b="8890"/>
+          <wp:inline distT="0" distB="0" distL="0" distR="0" wp14:anchorId="386AA4C3" wp14:editId="4D2F3666">
+            <wp:extent cx="5760720" cy="2842895"/>
+            <wp:effectExtent l="0" t="0" r="0" b="0"/>
             <wp:docPr id="1" name="Resim 1"/>
             <wp:cNvGraphicFramePr>
               <a:graphicFrameLocks xmlns:a="http://schemas.openxmlformats.org/drawingml/2006/main" noChangeAspect="1"/>
@@ -53,7 +86,7 @@
                   <pic:spPr>
                     <a:xfrm>
                       <a:off x="0" y="0"/>
-                      <a:ext cx="5760720" cy="2848610"/>
+                      <a:ext cx="5760720" cy="2842895"/>
                     </a:xfrm>
                     <a:prstGeom prst="rect">
                       <a:avLst/>
@@ -68,11 +101,62 @@
     </w:p>
     <w:p>
       <w:r>
-        <w:t>Buda farklı bir pluginden bu kod yazdığım saati değil arka planda açıksa bile zaman sayıyo o yüzden 10 saat al code write o al promt anti gravitye konu anlattırdım onlar</w:t>
+        <w:t xml:space="preserve">Buda farklı bir </w:t>
+      </w:r>
+      <w:proofErr w:type="spellStart"/>
+      <w:r>
+        <w:t>pluginden</w:t>
+      </w:r>
+      <w:proofErr w:type="spellEnd"/>
+      <w:r>
+        <w:t xml:space="preserve"> bu kod yazdığım saati değil arka planda açıksa bile zaman </w:t>
+      </w:r>
+      <w:proofErr w:type="spellStart"/>
+      <w:r>
+        <w:t>sayıyo</w:t>
+      </w:r>
+      <w:proofErr w:type="spellEnd"/>
+      <w:r>
+        <w:t xml:space="preserve"> o yüzden 10 saat al </w:t>
+      </w:r>
+      <w:proofErr w:type="spellStart"/>
+      <w:r>
+        <w:t>code</w:t>
+      </w:r>
+      <w:proofErr w:type="spellEnd"/>
+      <w:r>
+        <w:t xml:space="preserve"> </w:t>
+      </w:r>
+      <w:proofErr w:type="spellStart"/>
+      <w:r>
+        <w:t>write</w:t>
+      </w:r>
+      <w:proofErr w:type="spellEnd"/>
+      <w:r>
+        <w:t xml:space="preserve"> o al </w:t>
+      </w:r>
+      <w:proofErr w:type="spellStart"/>
+      <w:r>
+        <w:t>promt</w:t>
+      </w:r>
+      <w:proofErr w:type="spellEnd"/>
+      <w:r>
+        <w:t xml:space="preserve"> anti </w:t>
+      </w:r>
+      <w:proofErr w:type="spellStart"/>
+      <w:r>
+        <w:t>gravitye</w:t>
+      </w:r>
+      <w:proofErr w:type="spellEnd"/>
+      <w:r>
+        <w:t xml:space="preserve"> konu anlattırdım onlar</w:t>
       </w:r>
     </w:p>
     <w:p>
       <w:r>
+        <w:rPr>
+          <w:noProof/>
+        </w:rPr>
         <w:drawing>
           <wp:inline distT="0" distB="0" distL="0" distR="0" wp14:anchorId="3739113E" wp14:editId="235751AA">
             <wp:extent cx="5344271" cy="3077004"/>

</xml_diff>

<commit_message>
room database v4 commit
</commit_message>
<xml_diff>
--- a/WorkTime.docx
+++ b/WorkTime.docx
@@ -4,68 +4,48 @@
   <w:body>
     <w:p>
       <w:r>
-        <w:t>4h18m</w:t>
-      </w:r>
-      <w:r>
-        <w:t>m toplam çalışma süresi bu süre https://analogwakatime.com/dashboard adresinden ve orası toplam kod yazma süresi</w:t>
+        <w:t>5h</w:t>
+      </w:r>
+      <w:r>
+        <w:t xml:space="preserve"> toplam çalışma süresi bu süre https://analogwakatime.com/dashboard adresinden ve orası toplam kod yazma süresi</w:t>
       </w:r>
     </w:p>
     <w:p>
-      <w:proofErr w:type="gramStart"/>
-      <w:r>
-        <w:t>gün</w:t>
-      </w:r>
-      <w:proofErr w:type="gramEnd"/>
-      <w:r>
-        <w:t xml:space="preserve"> 1 : 1h</w:t>
+      <w:r>
+        <w:t>gün 1 : 1h</w:t>
       </w:r>
     </w:p>
     <w:p>
-      <w:proofErr w:type="gramStart"/>
-      <w:r>
-        <w:t>gün</w:t>
-      </w:r>
-      <w:proofErr w:type="gramEnd"/>
-      <w:r>
-        <w:t xml:space="preserve"> 2 : 45m</w:t>
+      <w:r>
+        <w:t>gün 2 : 45m</w:t>
       </w:r>
     </w:p>
     <w:p>
-      <w:proofErr w:type="gramStart"/>
-      <w:r>
-        <w:t>gün</w:t>
-      </w:r>
-      <w:proofErr w:type="gramEnd"/>
-      <w:r>
-        <w:t xml:space="preserve"> 3 : 36m</w:t>
+      <w:r>
+        <w:t>gün 3 : 36m</w:t>
       </w:r>
     </w:p>
     <w:p>
-      <w:proofErr w:type="gramStart"/>
-      <w:r>
-        <w:t>gün</w:t>
-      </w:r>
-      <w:proofErr w:type="gramEnd"/>
-      <w:r>
-        <w:t xml:space="preserve"> 4 : 1h 3m</w:t>
+      <w:r>
+        <w:t>gün 4 : 1h 3m</w:t>
       </w:r>
     </w:p>
     <w:p>
-      <w:proofErr w:type="gramStart"/>
-      <w:r>
-        <w:t>gün</w:t>
-      </w:r>
-      <w:proofErr w:type="gramEnd"/>
-      <w:r>
-        <w:t xml:space="preserve"> 5 : 53m</w:t>
+      <w:r>
+        <w:t>gün 5 : 53m</w:t>
       </w:r>
     </w:p>
     <w:p>
       <w:r>
+        <w:t>gün 6 : 39m</w:t>
+      </w:r>
+    </w:p>
+    <w:p>
+      <w:r>
         <w:drawing>
-          <wp:inline distT="0" distB="0" distL="0" distR="0" wp14:anchorId="386AA4C3" wp14:editId="4D2F3666">
-            <wp:extent cx="5760720" cy="2842895"/>
-            <wp:effectExtent l="0" t="0" r="0" b="0"/>
+          <wp:inline distT="0" distB="0" distL="0" distR="0" wp14:anchorId="044DE5D7" wp14:editId="3FC2F5B3">
+            <wp:extent cx="5760720" cy="3103880"/>
+            <wp:effectExtent l="0" t="0" r="0" b="1270"/>
             <wp:docPr id="1" name="Resim 1"/>
             <wp:cNvGraphicFramePr>
               <a:graphicFrameLocks xmlns:a="http://schemas.openxmlformats.org/drawingml/2006/main" noChangeAspect="1"/>
@@ -78,7 +58,7 @@
                     <pic:cNvPicPr/>
                   </pic:nvPicPr>
                   <pic:blipFill>
-                    <a:blip r:embed="rId4"/>
+                    <a:blip r:embed="rId6"/>
                     <a:stretch>
                       <a:fillRect/>
                     </a:stretch>
@@ -86,7 +66,7 @@
                   <pic:spPr>
                     <a:xfrm>
                       <a:off x="0" y="0"/>
-                      <a:ext cx="5760720" cy="2842895"/>
+                      <a:ext cx="5760720" cy="3103880"/>
                     </a:xfrm>
                     <a:prstGeom prst="rect">
                       <a:avLst/>
@@ -101,55 +81,21 @@
     </w:p>
     <w:p>
       <w:r>
-        <w:t xml:space="preserve">Buda farklı bir </w:t>
-      </w:r>
-      <w:proofErr w:type="spellStart"/>
-      <w:r>
-        <w:t>pluginden</w:t>
-      </w:r>
-      <w:proofErr w:type="spellEnd"/>
-      <w:r>
-        <w:t xml:space="preserve"> bu kod yazdığım saati değil arka planda açıksa bile zaman </w:t>
-      </w:r>
-      <w:proofErr w:type="spellStart"/>
-      <w:r>
-        <w:t>sayıyo</w:t>
-      </w:r>
-      <w:proofErr w:type="spellEnd"/>
-      <w:r>
-        <w:t xml:space="preserve"> o yüzden 10 saat al </w:t>
-      </w:r>
-      <w:proofErr w:type="spellStart"/>
-      <w:r>
-        <w:t>code</w:t>
-      </w:r>
-      <w:proofErr w:type="spellEnd"/>
-      <w:r>
-        <w:t xml:space="preserve"> </w:t>
-      </w:r>
-      <w:proofErr w:type="spellStart"/>
-      <w:r>
-        <w:t>write</w:t>
-      </w:r>
-      <w:proofErr w:type="spellEnd"/>
-      <w:r>
-        <w:t xml:space="preserve"> o al </w:t>
-      </w:r>
-      <w:proofErr w:type="spellStart"/>
-      <w:r>
-        <w:t>promt</w:t>
-      </w:r>
-      <w:proofErr w:type="spellEnd"/>
-      <w:r>
-        <w:t xml:space="preserve"> anti </w:t>
-      </w:r>
-      <w:proofErr w:type="spellStart"/>
-      <w:r>
-        <w:t>gravitye</w:t>
-      </w:r>
-      <w:proofErr w:type="spellEnd"/>
-      <w:r>
-        <w:t xml:space="preserve"> konu anlattırdım onlar</w:t>
+        <w:t>Buda farklı bir pluginden bu kod yazdığım saati değil arka planda açıksa bile zaman sayıyo o yüzden 10 saat al code write o al promt anti gravitye konu anlattırdım onlar</w:t>
+      </w:r>
+    </w:p>
+    <w:p/>
+    <w:p/>
+    <w:p/>
+    <w:p/>
+    <w:p/>
+    <w:p/>
+    <w:p/>
+    <w:p/>
+    <w:p>
+      <w:r>
+        <w:lastRenderedPageBreak/>
+        <w:t>Hafta1 den</w:t>
       </w:r>
     </w:p>
     <w:p>
@@ -173,7 +119,7 @@
                     <pic:cNvPicPr/>
                   </pic:nvPicPr>
                   <pic:blipFill>
-                    <a:blip r:embed="rId5"/>
+                    <a:blip r:embed="rId7"/>
                     <a:stretch>
                       <a:fillRect/>
                     </a:stretch>
@@ -194,6 +140,48 @@
         </w:drawing>
       </w:r>
     </w:p>
+    <w:p>
+      <w:r>
+        <w:t xml:space="preserve">Sitede hafta 2 oldu </w:t>
+      </w:r>
+      <w:r>
+        <w:drawing>
+          <wp:inline distT="0" distB="0" distL="0" distR="0" wp14:anchorId="51DA765E" wp14:editId="44FBCC6A">
+            <wp:extent cx="5687219" cy="3315163"/>
+            <wp:effectExtent l="0" t="0" r="8890" b="0"/>
+            <wp:docPr id="3" name="Resim 3"/>
+            <wp:cNvGraphicFramePr>
+              <a:graphicFrameLocks xmlns:a="http://schemas.openxmlformats.org/drawingml/2006/main" noChangeAspect="1"/>
+            </wp:cNvGraphicFramePr>
+            <a:graphic xmlns:a="http://schemas.openxmlformats.org/drawingml/2006/main">
+              <a:graphicData uri="http://schemas.openxmlformats.org/drawingml/2006/picture">
+                <pic:pic xmlns:pic="http://schemas.openxmlformats.org/drawingml/2006/picture">
+                  <pic:nvPicPr>
+                    <pic:cNvPr id="1" name=""/>
+                    <pic:cNvPicPr/>
+                  </pic:nvPicPr>
+                  <pic:blipFill>
+                    <a:blip r:embed="rId8"/>
+                    <a:stretch>
+                      <a:fillRect/>
+                    </a:stretch>
+                  </pic:blipFill>
+                  <pic:spPr>
+                    <a:xfrm>
+                      <a:off x="0" y="0"/>
+                      <a:ext cx="5687219" cy="3315163"/>
+                    </a:xfrm>
+                    <a:prstGeom prst="rect">
+                      <a:avLst/>
+                    </a:prstGeom>
+                  </pic:spPr>
+                </pic:pic>
+              </a:graphicData>
+            </a:graphic>
+          </wp:inline>
+        </w:drawing>
+      </w:r>
+    </w:p>
     <w:sectPr>
       <w:pgSz w:w="11906" w:h="16838"/>
       <w:pgMar w:top="1417" w:right="1417" w:bottom="1417" w:left="1417" w:header="708" w:footer="708" w:gutter="0"/>
@@ -202,6 +190,56 @@
     </w:sectPr>
   </w:body>
 </w:document>
+</file>
+
+<file path=word/endnotes.xml><?xml version="1.0" encoding="utf-8"?>
+<w:endnotes xmlns:wpc="http://schemas.microsoft.com/office/word/2010/wordprocessingCanvas" xmlns:cx="http://schemas.microsoft.com/office/drawing/2014/chartex" xmlns:cx1="http://schemas.microsoft.com/office/drawing/2015/9/8/chartex" xmlns:cx2="http://schemas.microsoft.com/office/drawing/2015/10/21/chartex" xmlns:cx3="http://schemas.microsoft.com/office/drawing/2016/5/9/chartex" xmlns:cx4="http://schemas.microsoft.com/office/drawing/2016/5/10/chartex" xmlns:cx5="http://schemas.microsoft.com/office/drawing/2016/5/11/chartex" xmlns:cx6="http://schemas.microsoft.com/office/drawing/2016/5/12/chartex" xmlns:cx7="http://schemas.microsoft.com/office/drawing/2016/5/13/chartex" xmlns:cx8="http://schemas.microsoft.com/office/drawing/2016/5/14/chartex" xmlns:mc="http://schemas.openxmlformats.org/markup-compatibility/2006" xmlns:aink="http://schemas.microsoft.com/office/drawing/2016/ink" xmlns:am3d="http://schemas.microsoft.com/office/drawing/2017/model3d" xmlns:o="urn:schemas-microsoft-com:office:office" xmlns:oel="http://schemas.microsoft.com/office/2019/extlst" xmlns:r="http://schemas.openxmlformats.org/officeDocument/2006/relationships" xmlns:m="http://schemas.openxmlformats.org/officeDocument/2006/math" xmlns:v="urn:schemas-microsoft-com:vml" xmlns:wp14="http://schemas.microsoft.com/office/word/2010/wordprocessingDrawing" xmlns:wp="http://schemas.openxmlformats.org/drawingml/2006/wordprocessingDrawing" xmlns:w10="urn:schemas-microsoft-com:office:word" xmlns:w="http://schemas.openxmlformats.org/wordprocessingml/2006/main" xmlns:w14="http://schemas.microsoft.com/office/word/2010/wordml" xmlns:w15="http://schemas.microsoft.com/office/word/2012/wordml" xmlns:w16cex="http://schemas.microsoft.com/office/word/2018/wordml/cex" xmlns:w16cid="http://schemas.microsoft.com/office/word/2016/wordml/cid" xmlns:w16="http://schemas.microsoft.com/office/word/2018/wordml" xmlns:w16sdtdh="http://schemas.microsoft.com/office/word/2020/wordml/sdtdatahash" xmlns:w16se="http://schemas.microsoft.com/office/word/2015/wordml/symex" xmlns:wpg="http://schemas.microsoft.com/office/word/2010/wordprocessingGroup" xmlns:wpi="http://schemas.microsoft.com/office/word/2010/wordprocessingInk" xmlns:wne="http://schemas.microsoft.com/office/word/2006/wordml" xmlns:wps="http://schemas.microsoft.com/office/word/2010/wordprocessingShape" mc:Ignorable="w14 w15 w16se w16cid w16 w16cex w16sdtdh wp14">
+  <w:endnote w:type="separator" w:id="-1">
+    <w:p>
+      <w:pPr>
+        <w:spacing w:after="0" w:line="240" w:lineRule="auto"/>
+      </w:pPr>
+      <w:r>
+        <w:separator/>
+      </w:r>
+    </w:p>
+  </w:endnote>
+  <w:endnote w:type="continuationSeparator" w:id="0">
+    <w:p>
+      <w:pPr>
+        <w:spacing w:after="0" w:line="240" w:lineRule="auto"/>
+      </w:pPr>
+      <w:r>
+        <w:continuationSeparator/>
+      </w:r>
+    </w:p>
+  </w:endnote>
+</w:endnotes>
+</file>
+
+<file path=word/footnotes.xml><?xml version="1.0" encoding="utf-8"?>
+<w:footnotes xmlns:wpc="http://schemas.microsoft.com/office/word/2010/wordprocessingCanvas" xmlns:cx="http://schemas.microsoft.com/office/drawing/2014/chartex" xmlns:cx1="http://schemas.microsoft.com/office/drawing/2015/9/8/chartex" xmlns:cx2="http://schemas.microsoft.com/office/drawing/2015/10/21/chartex" xmlns:cx3="http://schemas.microsoft.com/office/drawing/2016/5/9/chartex" xmlns:cx4="http://schemas.microsoft.com/office/drawing/2016/5/10/chartex" xmlns:cx5="http://schemas.microsoft.com/office/drawing/2016/5/11/chartex" xmlns:cx6="http://schemas.microsoft.com/office/drawing/2016/5/12/chartex" xmlns:cx7="http://schemas.microsoft.com/office/drawing/2016/5/13/chartex" xmlns:cx8="http://schemas.microsoft.com/office/drawing/2016/5/14/chartex" xmlns:mc="http://schemas.openxmlformats.org/markup-compatibility/2006" xmlns:aink="http://schemas.microsoft.com/office/drawing/2016/ink" xmlns:am3d="http://schemas.microsoft.com/office/drawing/2017/model3d" xmlns:o="urn:schemas-microsoft-com:office:office" xmlns:oel="http://schemas.microsoft.com/office/2019/extlst" xmlns:r="http://schemas.openxmlformats.org/officeDocument/2006/relationships" xmlns:m="http://schemas.openxmlformats.org/officeDocument/2006/math" xmlns:v="urn:schemas-microsoft-com:vml" xmlns:wp14="http://schemas.microsoft.com/office/word/2010/wordprocessingDrawing" xmlns:wp="http://schemas.openxmlformats.org/drawingml/2006/wordprocessingDrawing" xmlns:w10="urn:schemas-microsoft-com:office:word" xmlns:w="http://schemas.openxmlformats.org/wordprocessingml/2006/main" xmlns:w14="http://schemas.microsoft.com/office/word/2010/wordml" xmlns:w15="http://schemas.microsoft.com/office/word/2012/wordml" xmlns:w16cex="http://schemas.microsoft.com/office/word/2018/wordml/cex" xmlns:w16cid="http://schemas.microsoft.com/office/word/2016/wordml/cid" xmlns:w16="http://schemas.microsoft.com/office/word/2018/wordml" xmlns:w16sdtdh="http://schemas.microsoft.com/office/word/2020/wordml/sdtdatahash" xmlns:w16se="http://schemas.microsoft.com/office/word/2015/wordml/symex" xmlns:wpg="http://schemas.microsoft.com/office/word/2010/wordprocessingGroup" xmlns:wpi="http://schemas.microsoft.com/office/word/2010/wordprocessingInk" xmlns:wne="http://schemas.microsoft.com/office/word/2006/wordml" xmlns:wps="http://schemas.microsoft.com/office/word/2010/wordprocessingShape" mc:Ignorable="w14 w15 w16se w16cid w16 w16cex w16sdtdh wp14">
+  <w:footnote w:type="separator" w:id="-1">
+    <w:p>
+      <w:pPr>
+        <w:spacing w:after="0" w:line="240" w:lineRule="auto"/>
+      </w:pPr>
+      <w:r>
+        <w:separator/>
+      </w:r>
+    </w:p>
+  </w:footnote>
+  <w:footnote w:type="continuationSeparator" w:id="0">
+    <w:p>
+      <w:pPr>
+        <w:spacing w:after="0" w:line="240" w:lineRule="auto"/>
+      </w:pPr>
+      <w:r>
+        <w:continuationSeparator/>
+      </w:r>
+    </w:p>
+  </w:footnote>
+</w:footnotes>
 </file>
 
 <file path=word/styles.xml><?xml version="1.0" encoding="utf-8"?>
@@ -1121,6 +1159,50 @@
       <w:spacing w:val="5"/>
     </w:rPr>
   </w:style>
+  <w:style w:type="paragraph" w:styleId="stBilgi">
+    <w:name w:val="header"/>
+    <w:basedOn w:val="Normal"/>
+    <w:link w:val="stBilgiChar"/>
+    <w:uiPriority w:val="99"/>
+    <w:unhideWhenUsed/>
+    <w:rsid w:val="004D4C0E"/>
+    <w:pPr>
+      <w:tabs>
+        <w:tab w:val="center" w:pos="4536"/>
+        <w:tab w:val="right" w:pos="9072"/>
+      </w:tabs>
+      <w:spacing w:after="0" w:line="240" w:lineRule="auto"/>
+    </w:pPr>
+  </w:style>
+  <w:style w:type="character" w:customStyle="1" w:styleId="stBilgiChar">
+    <w:name w:val="Üst Bilgi Char"/>
+    <w:basedOn w:val="VarsaylanParagrafYazTipi"/>
+    <w:link w:val="stBilgi"/>
+    <w:uiPriority w:val="99"/>
+    <w:rsid w:val="004D4C0E"/>
+  </w:style>
+  <w:style w:type="paragraph" w:styleId="AltBilgi">
+    <w:name w:val="footer"/>
+    <w:basedOn w:val="Normal"/>
+    <w:link w:val="AltBilgiChar"/>
+    <w:uiPriority w:val="99"/>
+    <w:unhideWhenUsed/>
+    <w:rsid w:val="004D4C0E"/>
+    <w:pPr>
+      <w:tabs>
+        <w:tab w:val="center" w:pos="4536"/>
+        <w:tab w:val="right" w:pos="9072"/>
+      </w:tabs>
+      <w:spacing w:after="0" w:line="240" w:lineRule="auto"/>
+    </w:pPr>
+  </w:style>
+  <w:style w:type="character" w:customStyle="1" w:styleId="AltBilgiChar">
+    <w:name w:val="Alt Bilgi Char"/>
+    <w:basedOn w:val="VarsaylanParagrafYazTipi"/>
+    <w:link w:val="AltBilgi"/>
+    <w:uiPriority w:val="99"/>
+    <w:rsid w:val="004D4C0E"/>
+  </w:style>
 </w:styles>
 </file>
 

</xml_diff>